<commit_message>
feat: implement clinico module with dedicated UI components, state management, and supporting documentation
</commit_message>
<xml_diff>
--- a/docs/clinico/apresentacao/Roteiro-Apresentacao-Modulo-Clinico.docx
+++ b/docs/clinico/apresentacao/Roteiro-Apresentacao-Modulo-Clinico.docx
@@ -492,7 +492,25 @@
           <w:sz w:val="21"/>
           <w:szCs w:val="21"/>
         </w:rPr>
-        <w:t xml:space="preserve">O portal guarda essa escolha no navegador: uma vez ligado, continua ligado naquele computador.</w:t>
+        <w:t xml:space="preserve">O portal guarda essa escolha </w:t>
+      </w:r>
+      <w:r>
+        <w:rPr>
+          <w:b/>
+          <w:bCs/>
+          <w:color w:val="1F2F2B"/>
+          <w:sz w:val="21"/>
+          <w:szCs w:val="21"/>
+        </w:rPr>
+        <w:t xml:space="preserve">para a conta que está logada</w:t>
+      </w:r>
+      <w:r>
+        <w:rPr>
+          <w:color w:val="1F2F2B"/>
+          <w:sz w:val="21"/>
+          <w:szCs w:val="21"/>
+        </w:rPr>
+        <w:t xml:space="preserve">, naquele computador. Ou seja: ligue com a conta que você vai usar para apresentar. Se outra pessoa entrar na mesma máquina com a conta dela, o módulo volta a ficar invisível — que é o comportamento correto, e o motivo de ele nunca aparecer para um cliente por acidente.</w:t>
       </w:r>
     </w:p>
     <w:p>
@@ -4951,7 +4969,7 @@
                 <w:sz w:val="19"/>
                 <w:szCs w:val="19"/>
               </w:rPr>
-              <w:t xml:space="preserve">O módulo está desligado. Acrescente ?clinico=on ao endereço e recarregue. Se persistir, digite “clinico” com a tela aberta, fora de um campo de texto.</w:t>
+              <w:t xml:space="preserve">O módulo está desligado para esta conta. Acrescente ?clinico=on ao endereço e recarregue, ou digite “clinico” com a tela aberta, fora de um campo de texto. Confirme também que você está logado com a conta em que ligou.</w:t>
             </w:r>
           </w:p>
         </w:tc>

</xml_diff>